<commit_message>
Fix duplicate alerts: safer prune + cache save/restore
</commit_message>
<xml_diff>
--- a/Score App Notes.docx
+++ b/Score App Notes.docx
@@ -139,6 +139,76 @@
       <w:r>
         <w:t>/bin/activate</w:t>
       </w:r>
+    </w:p>
+    <w:p>
+      <w:pPr>
+        <w:ind w:left="360"/>
+      </w:pPr>
+    </w:p>
+    <w:p>
+      <w:pPr>
+        <w:ind w:left="360"/>
+      </w:pPr>
+      <w:r>
+        <w:t>To commit code changes:</w:t>
+      </w:r>
+    </w:p>
+    <w:p>
+      <w:pPr>
+        <w:ind w:left="360"/>
+      </w:pPr>
+      <w:r>
+        <w:t># 1. Stage the changed files</w:t>
+      </w:r>
+    </w:p>
+    <w:p>
+      <w:pPr>
+        <w:ind w:left="360"/>
+      </w:pPr>
+      <w:r>
+        <w:t>git add day06_close_game_detector.py</w:t>
+      </w:r>
+    </w:p>
+    <w:p>
+      <w:pPr>
+        <w:ind w:left="360"/>
+      </w:pPr>
+      <w:r>
+        <w:t># 2. Create a commit (saves the changes locally)</w:t>
+      </w:r>
+    </w:p>
+    <w:p>
+      <w:pPr>
+        <w:ind w:left="360"/>
+      </w:pPr>
+      <w:r>
+        <w:t>git commit -m "Fix: Eastern date for scoreboard, debug logging, defensive period parsing"</w:t>
+      </w:r>
+    </w:p>
+    <w:p>
+      <w:pPr>
+        <w:ind w:left="360"/>
+      </w:pPr>
+      <w:r>
+        <w:t># 3. Send that commit to GitHub</w:t>
+      </w:r>
+    </w:p>
+    <w:p>
+      <w:pPr>
+        <w:ind w:left="360"/>
+      </w:pPr>
+      <w:r>
+        <w:t>git push origin main</w:t>
+      </w:r>
+    </w:p>
+    <w:p>
+      <w:pPr>
+        <w:ind w:left="360"/>
+        <w:rPr>
+          <w:rFonts w:cs="Times New Roman (Body CS)"/>
+          <w:caps/>
+        </w:rPr>
+      </w:pPr>
     </w:p>
     <w:sectPr>
       <w:pgSz w:w="12240" w:h="15840"/>
@@ -1250,6 +1320,18 @@
       <w:spacing w:val="5"/>
     </w:rPr>
   </w:style>
+  <w:style w:type="character" w:styleId="Hyperlink">
+    <w:name w:val="Hyperlink"/>
+    <w:basedOn w:val="DefaultParagraphFont"/>
+    <w:uiPriority w:val="99"/>
+    <w:semiHidden/>
+    <w:unhideWhenUsed/>
+    <w:rsid w:val="0051021C"/>
+    <w:rPr>
+      <w:color w:val="0000FF"/>
+      <w:u w:val="single"/>
+    </w:rPr>
+  </w:style>
 </w:styles>
 </file>
 

</xml_diff>